<commit_message>
Apply warm brown-beige executive palette, replace bullet dots with en-dashes, and refine natural technical tone across all Word documents
</commit_message>
<xml_diff>
--- a/HUONG_DAN_CHI_TIET_XU_LY_BUOC_1_VA_2.docx
+++ b/HUONG_DAN_CHI_TIET_XU_LY_BUOC_1_VA_2.docx
@@ -11,10 +11,10 @@
         <w:rPr>
           <w:rFonts w:ascii="Calibri" w:hAnsi="Calibri"/>
           <w:b/>
-          <w:color w:val="2980B9"/>
-          <w:sz w:val="22"/>
+          <w:color w:val="7A5230"/>
+          <w:sz w:val="21"/>
         </w:rPr>
-        <w:t>DỰ ÁN KHẢO SÁT HIỆN TRƯỜNG &amp; TỰ ĐỘNG HÓA BÁO CÁO (GIS CONNECT)</w:t>
+        <w:t>DỰ ÁN KHẢO SÁT HIỆN TRƯỜNG &amp; TỰ ĐỘNG HÓA DỮ LIỆU BÁO CÁO (GIS CONNECT)</w:t>
         <w:br/>
       </w:r>
     </w:p>
@@ -27,14 +27,14 @@
         <w:rPr>
           <w:rFonts w:ascii="Calibri" w:hAnsi="Calibri"/>
           <w:b/>
-          <w:color w:val="003366"/>
-          <w:sz w:val="30"/>
+          <w:color w:val="4A3525"/>
+          <w:sz w:val="29"/>
         </w:rPr>
         <w:t>HƯỚNG DẪN KỸ THUẬT CHI TIẾT:</w:t>
         <w:br/>
-        <w:t>CƠ CHẾ XỬ LÝ BƯỚC 1 (FORMAT DỮ LIỆU FORM)</w:t>
+        <w:t>CƠ CHẾ XỬ LÝ DỮ LIỆU BIỂU MẪU (BƯỚC 1)</w:t>
         <w:br/>
-        <w:t>VÀ BƯỚC 2 (MÃ HÓA, NÉN ẢNH, WATERMARK TẠI MÁY KHÁCH)</w:t>
+        <w:t>VÀ THUẬT TOÁN MÃ HÓA, NÉN ẢNH, WATERMARK TẠI MÁY KHÁCH (BƯỚC 2)</w:t>
       </w:r>
     </w:p>
     <w:p>
@@ -46,10 +46,10 @@
         <w:rPr>
           <w:rFonts w:ascii="Calibri" w:hAnsi="Calibri"/>
           <w:i/>
-          <w:color w:val="718096"/>
+          <w:color w:val="7D736E"/>
           <w:sz w:val="19"/>
         </w:rPr>
-        <w:t>Tài liệu đặc tả giải pháp kỹ thuật (Technical Specifications &amp; Implementation Guide) — Tháng 09/2026</w:t>
+        <w:t>Tài liệu đặc tả giải pháp kỹ thuật luồng dữ liệu đầu vào — Cập nhật Tháng 09/2026</w:t>
       </w:r>
     </w:p>
     <w:p>
@@ -61,10 +61,10 @@
         <w:rPr>
           <w:rFonts w:ascii="Calibri" w:hAnsi="Calibri"/>
           <w:b/>
-          <w:color w:val="003366"/>
-          <w:sz w:val="26"/>
+          <w:color w:val="4A3525"/>
+          <w:sz w:val="27"/>
         </w:rPr>
-        <w:t>I. MỤC TIÊU KỸ THUẬT CỦA BƯỚC 1 &amp; BƯỚC 2</w:t>
+        <w:t>I. MỤC TIÊU KỸ THUẬT CỦA BƯỚC 1 VÀ BƯỚC 2</w:t>
       </w:r>
     </w:p>
     <w:p>
@@ -75,58 +75,74 @@
         <w:rPr>
           <w:rFonts w:ascii="Calibri" w:hAnsi="Calibri"/>
           <w:i w:val="0"/>
-          <w:color w:val="2D3748"/>
+          <w:color w:val="2C2523"/>
           <w:sz w:val="20"/>
         </w:rPr>
-        <w:t>Toàn bộ sự thành bại của việc xuất báo cáo tự động và liên kết bản đồ GIS đều phụ thuộc 100% vào **khâu thu thập đầu vào (Bước 1 &amp; Bước 2)**. Nếu đầu vào bị sai, ảnh đặt tên ngẫu nhiên hoặc file quá nặng làm nghẽn mạng thì toàn bộ các bước sau đều sụp đổ.</w:t>
+        <w:t>Hiệu quả của việc tự động hóa báo cáo và đồng bộ dữ liệu GIS phụ thuộc trực tiếp vào tính chuẩn xác của khâu thu thập hiện trường (Bước 1 và Bước 2). Khi dữ liệu đầu vào được kiểm soát chặt chẽ ngay tại nguồn, các công đoạn tổng hợp và xử lý phía sau sẽ diễn ra hoàn toàn tự động:</w:t>
       </w:r>
     </w:p>
     <w:p>
       <w:pPr>
-        <w:pStyle w:val="ListBullet"/>
         <w:spacing w:before="20" w:after="40" w:line="276" w:lineRule="auto"/>
-        <w:ind w:left="360"/>
+        <w:ind w:left="288"/>
       </w:pPr>
       <w:r>
         <w:rPr>
           <w:rFonts w:ascii="Calibri" w:hAnsi="Calibri"/>
           <w:b/>
-          <w:color w:val="2D3748"/>
+          <w:color w:val="7A5230"/>
           <w:sz w:val="20"/>
         </w:rPr>
-        <w:t xml:space="preserve">Mục tiêu Bước 1 (Format Biểu Mẫu): </w:t>
+        <w:t xml:space="preserve">–  </w:t>
       </w:r>
       <w:r>
         <w:rPr>
           <w:rFonts w:ascii="Calibri" w:hAnsi="Calibri"/>
-          <w:color w:val="2D3748"/>
+          <w:b/>
+          <w:color w:val="2C2523"/>
           <w:sz w:val="20"/>
         </w:rPr>
-        <w:t>Biến biểu mẫu nhập liệu từ một form thông thường thành một form có cấu trúc chặt chẽ (Structured Schema). Khảo sát viên không cần gõ tay nhiều, giảm thiểu 95% sai sót con người.</w:t>
+        <w:t xml:space="preserve">Mục tiêu Bước 1 (Format dữ liệu): </w:t>
+      </w:r>
+      <w:r>
+        <w:rPr>
+          <w:rFonts w:ascii="Calibri" w:hAnsi="Calibri"/>
+          <w:color w:val="2C2523"/>
+          <w:sz w:val="20"/>
+        </w:rPr>
+        <w:t>Chuyển đổi hình thức nhập liệu từ các biểu mẫu tự do thành biểu mẫu có cấu trúc định sẵn. Khảo sát viên không cần nhập liệu thủ công nhiều, giúp hạn chế tối đa các sai sót phát sinh trong quá trình ghi nhận.</w:t>
       </w:r>
     </w:p>
     <w:p>
       <w:pPr>
-        <w:pStyle w:val="ListBullet"/>
         <w:spacing w:before="20" w:after="40" w:line="276" w:lineRule="auto"/>
-        <w:ind w:left="360"/>
+        <w:ind w:left="288"/>
       </w:pPr>
       <w:r>
         <w:rPr>
           <w:rFonts w:ascii="Calibri" w:hAnsi="Calibri"/>
           <w:b/>
-          <w:color w:val="2D3748"/>
+          <w:color w:val="7A5230"/>
           <w:sz w:val="20"/>
         </w:rPr>
-        <w:t xml:space="preserve">Mục tiêu Bước 2 (Xử Lý Ảnh Máy Khách): </w:t>
+        <w:t xml:space="preserve">–  </w:t>
       </w:r>
       <w:r>
         <w:rPr>
           <w:rFonts w:ascii="Calibri" w:hAnsi="Calibri"/>
-          <w:color w:val="2D3748"/>
+          <w:b/>
+          <w:color w:val="2C2523"/>
           <w:sz w:val="20"/>
         </w:rPr>
-        <w:t>Toàn bộ công tác xử lý ảnh (Đổi tên, Nén dung lượng, Đóng dấu Watermark tọa độ/thời gian) phải được thực thi trực tiếp trên trình duyệt điện thoại của khảo sát viên (Client-side) ngay khoảnh khắc chụp ảnh, trước khi gửi bất kỳ byte dữ liệu nào về máy chủ.</w:t>
+        <w:t xml:space="preserve">Mục tiêu Bước 2 (Xử lý ảnh tại máy khách): </w:t>
+      </w:r>
+      <w:r>
+        <w:rPr>
+          <w:rFonts w:ascii="Calibri" w:hAnsi="Calibri"/>
+          <w:color w:val="2C2523"/>
+          <w:sz w:val="20"/>
+        </w:rPr>
+        <w:t>Mọi công đoạn xử lý hình ảnh bao gồm đổi tên, nén dung lượng và đóng dấu thông tin thực địa (tọa độ GPS, thời gian) đều được thực hiện trực tiếp trên trình duyệt thiết bị di động (Client-side) ngay khi chụp, trước khi truyền tải về máy chủ.</w:t>
       </w:r>
     </w:p>
     <w:p>
@@ -138,8 +154,8 @@
         <w:rPr>
           <w:rFonts w:ascii="Calibri" w:hAnsi="Calibri"/>
           <w:b/>
-          <w:color w:val="003366"/>
-          <w:sz w:val="26"/>
+          <w:color w:val="4A3525"/>
+          <w:sz w:val="27"/>
         </w:rPr>
         <w:t>II. CHI TIẾT CƠ CHẾ XỬ LÝ BƯỚC 1: FORMAT BIỂU MẪU KHẢO SÁT</w:t>
       </w:r>
@@ -153,10 +169,10 @@
         <w:rPr>
           <w:rFonts w:ascii="Calibri" w:hAnsi="Calibri"/>
           <w:b/>
-          <w:color w:val="2980B9"/>
+          <w:color w:val="7A5230"/>
           <w:sz w:val="23"/>
         </w:rPr>
-        <w:t>1. Chuẩn Hóa Danh Mục Nhà Ga (Master Data Binding)</w:t>
+        <w:t>1. Chuẩn Hóa Danh Mục Nhà Ga Bằng Cơ Chế Liên Kết Dữ Liệu Gốc</w:t>
       </w:r>
     </w:p>
     <w:p>
@@ -167,82 +183,106 @@
         <w:rPr>
           <w:rFonts w:ascii="Calibri" w:hAnsi="Calibri"/>
           <w:i w:val="0"/>
-          <w:color w:val="2D3748"/>
+          <w:color w:val="2C2523"/>
           <w:sz w:val="20"/>
         </w:rPr>
-        <w:t>Thay vì để khảo sát viên tự gõ tên ga (rất dễ gõ sai chính tả như 'Phan van hon', 'S1_PVH', 'Ga s1' khiến máy tính không gom nhóm được), biểu mẫu sử dụng kỹ thuật liên kết dữ liệu danh mục:</w:t>
+        <w:t>Để tránh việc người khảo sát nhập tên trạm tùy tiện (ví dụ: viết tắt, sai lỗi chính tả khiến hệ thống không thể tự động tổng hợp), biểu mẫu áp dụng cơ chế nạp danh mục cố định:</w:t>
       </w:r>
     </w:p>
     <w:p>
       <w:pPr>
-        <w:pStyle w:val="ListBullet"/>
         <w:spacing w:before="20" w:after="40" w:line="276" w:lineRule="auto"/>
-        <w:ind w:left="360"/>
+        <w:ind w:left="288"/>
       </w:pPr>
       <w:r>
         <w:rPr>
           <w:rFonts w:ascii="Calibri" w:hAnsi="Calibri"/>
           <w:b/>
-          <w:color w:val="2D3748"/>
+          <w:color w:val="7A5230"/>
           <w:sz w:val="20"/>
         </w:rPr>
-        <w:t xml:space="preserve">Nạp danh mục: </w:t>
+        <w:t xml:space="preserve">–  </w:t>
       </w:r>
       <w:r>
         <w:rPr>
           <w:rFonts w:ascii="Calibri" w:hAnsi="Calibri"/>
-          <w:color w:val="2D3748"/>
+          <w:b/>
+          <w:color w:val="2C2523"/>
           <w:sz w:val="20"/>
         </w:rPr>
-        <w:t>Tải danh mục 26 nhà ga từ file cơ sở dữ liệu stations_db.json vào bộ nhớ ứng dụng.</w:t>
+        <w:t xml:space="preserve">Nạp danh mục trạm: </w:t>
+      </w:r>
+      <w:r>
+        <w:rPr>
+          <w:rFonts w:ascii="Calibri" w:hAnsi="Calibri"/>
+          <w:color w:val="2C2523"/>
+          <w:sz w:val="20"/>
+        </w:rPr>
+        <w:t>Dữ liệu danh mục 26 nhà ga thuộc Tuyến Metro số 2 được tải trực tiếp từ tệp cơ sở dữ liệu 'stations_db.json' vào bộ nhớ của ứng dụng.</w:t>
       </w:r>
     </w:p>
     <w:p>
       <w:pPr>
-        <w:pStyle w:val="ListBullet"/>
         <w:spacing w:before="20" w:after="40" w:line="276" w:lineRule="auto"/>
-        <w:ind w:left="360"/>
+        <w:ind w:left="288"/>
       </w:pPr>
       <w:r>
         <w:rPr>
           <w:rFonts w:ascii="Calibri" w:hAnsi="Calibri"/>
           <w:b/>
-          <w:color w:val="2D3748"/>
+          <w:color w:val="7A5230"/>
           <w:sz w:val="20"/>
         </w:rPr>
-        <w:t xml:space="preserve">Giao diện chọn: </w:t>
+        <w:t xml:space="preserve">–  </w:t>
       </w:r>
       <w:r>
         <w:rPr>
           <w:rFonts w:ascii="Calibri" w:hAnsi="Calibri"/>
-          <w:color w:val="2D3748"/>
+          <w:b/>
+          <w:color w:val="2C2523"/>
           <w:sz w:val="20"/>
         </w:rPr>
-        <w:t>Giao diện hiển thị Dropdown gồm [Mã Ga] - [Tên Ga] chuẩn mực. Ví dụ: S1 - Phan Văn Hớn, S2 - Đông Hưng Thuận, ..., S26 - Bến Thành.</w:t>
+        <w:t xml:space="preserve">Hiển thị lựa chọn: </w:t>
+      </w:r>
+      <w:r>
+        <w:rPr>
+          <w:rFonts w:ascii="Calibri" w:hAnsi="Calibri"/>
+          <w:color w:val="2C2523"/>
+          <w:sz w:val="20"/>
+        </w:rPr>
+        <w:t>Giao diện cung cấp danh sách dạng Dropdown gồm định dạng chuẩn [Mã Ga] - [Tên Ga]. Ví dụ: 'S1 - Phan Văn Hớn', 'S2 - Đông Hưng Thuận', ..., 'S26 - Bến Thành'.</w:t>
       </w:r>
     </w:p>
     <w:p>
       <w:pPr>
-        <w:pStyle w:val="ListBullet"/>
         <w:spacing w:before="20" w:after="40" w:line="276" w:lineRule="auto"/>
-        <w:ind w:left="360"/>
+        <w:ind w:left="288"/>
       </w:pPr>
       <w:r>
         <w:rPr>
           <w:rFonts w:ascii="Calibri" w:hAnsi="Calibri"/>
           <w:b/>
-          <w:color w:val="2D3748"/>
+          <w:color w:val="7A5230"/>
           <w:sz w:val="20"/>
         </w:rPr>
-        <w:t xml:space="preserve">Khóa dữ liệu ngầm: </w:t>
+        <w:t xml:space="preserve">–  </w:t>
       </w:r>
       <w:r>
         <w:rPr>
           <w:rFonts w:ascii="Calibri" w:hAnsi="Calibri"/>
-          <w:color w:val="2D3748"/>
+          <w:b/>
+          <w:color w:val="2C2523"/>
           <w:sz w:val="20"/>
         </w:rPr>
-        <w:t>Khi khảo sát viên chọn một ga, hệ thống lập tức gán ngầm các biến hệ thống: station_id = 'S1', station_lat = 10.836067, station_lng = 106.618255. Đây chính là khóa ngoại (Foreign Key) để tự động ghép ảnh và liên kết bản đồ GIS.</w:t>
+        <w:t xml:space="preserve">Khóa liên kết ngầm: </w:t>
+      </w:r>
+      <w:r>
+        <w:rPr>
+          <w:rFonts w:ascii="Calibri" w:hAnsi="Calibri"/>
+          <w:color w:val="2C2523"/>
+          <w:sz w:val="20"/>
+        </w:rPr>
+        <w:t>Khi người khảo sát chọn trạm, hệ thống tự động gán ngầm các giá trị định danh gồm station_id = 'S1', station_lat = 10.836067, station_lng = 106.618255. Đây là trường khóa phục vụ ghép nối ảnh và liên kết không gian trên bản đồ GIS.</w:t>
       </w:r>
     </w:p>
     <w:p>
@@ -254,10 +294,10 @@
         <w:rPr>
           <w:rFonts w:ascii="Calibri" w:hAnsi="Calibri"/>
           <w:b/>
-          <w:color w:val="2980B9"/>
+          <w:color w:val="7A5230"/>
           <w:sz w:val="23"/>
         </w:rPr>
-        <w:t>2. Cơ Chế Tự Động Bắt Tọa Độ Vệ Tinh (GPS Auto-Capture)</w:t>
+        <w:t>2. Cơ Chế Tự Động Ghi Nhận Tọa Độ Vệ Tinh (GPS Auto-Capture)</w:t>
       </w:r>
     </w:p>
     <w:p>
@@ -268,10 +308,10 @@
         <w:rPr>
           <w:rFonts w:ascii="Calibri" w:hAnsi="Calibri"/>
           <w:i w:val="0"/>
-          <w:color w:val="2D3748"/>
+          <w:color w:val="2C2523"/>
           <w:sz w:val="20"/>
         </w:rPr>
-        <w:t>Sử dụng chuẩn Geolocation API của HTML5 với độ chính xác cao nhất (High Accuracy):</w:t>
+        <w:t>Ứng dụng sử dụng hàm định vị tiêu chuẩn của trình duyệt (HTML5 Geolocation API) với cấu hình ưu tiên độ chính xác cao:</w:t>
       </w:r>
     </w:p>
     <w:tbl>
@@ -287,7 +327,7 @@
         <w:tc>
           <w:tcPr>
             <w:tcW w:type="dxa" w:w="9461"/>
-            <w:shd w:fill="F1F5F9"/>
+            <w:shd w:fill="F4EFE6"/>
             <w:tcMar>
               <w:top w:w="80" w:type="dxa"/>
               <w:bottom w:w="80" w:type="dxa"/>
@@ -295,10 +335,10 @@
               <w:right w:w="120" w:type="dxa"/>
             </w:tcMar>
             <w:tcBorders>
-              <w:top w:val="single" w:sz="4" w:space="0" w:color="CBD5E1"/>
-              <w:left w:val="single" w:sz="18" w:space="0" w:color="003366"/>
-              <w:bottom w:val="single" w:sz="4" w:space="0" w:color="CBD5E1"/>
-              <w:right w:val="single" w:sz="4" w:space="0" w:color="CBD5E1"/>
+              <w:top w:val="single" w:sz="4" w:space="0" w:color="D6CBBF"/>
+              <w:left w:val="single" w:sz="18" w:space="0" w:color="4A3525"/>
+              <w:bottom w:val="single" w:sz="4" w:space="0" w:color="D6CBBF"/>
+              <w:right w:val="single" w:sz="4" w:space="0" w:color="D6CBBF"/>
             </w:tcBorders>
           </w:tcPr>
           <w:p>
@@ -308,10 +348,10 @@
             <w:r>
               <w:rPr>
                 <w:rFonts w:ascii="Consolas" w:hAnsi="Consolas"/>
-                <w:color w:val="1E293B"/>
+                <w:color w:val="3C2D23"/>
                 <w:sz w:val="17"/>
               </w:rPr>
-              <w:t>// Cơ chế tự động bắt tọa độ khi mở form</w:t>
+              <w:t>// Ghi nhận tọa độ tự động khi mở biểu mẫu</w:t>
               <w:br/>
               <w:t>navigator.geolocation.getCurrentPosition(</w:t>
               <w:br/>
@@ -327,7 +367,7 @@
               <w:br/>
               <w:t xml:space="preserve">    },</w:t>
               <w:br/>
-              <w:t xml:space="preserve">    (err) =&gt; console.warn('Lỗi bắt GPS:', err),</w:t>
+              <w:t xml:space="preserve">    (err) =&gt; console.warn('Lỗi định vị GPS:', err),</w:t>
               <w:br/>
               <w:t xml:space="preserve">    { enableHighAccuracy: true, timeout: 10000, maximumAge: 0 }</w:t>
               <w:br/>
@@ -350,10 +390,10 @@
         <w:rPr>
           <w:rFonts w:ascii="Calibri" w:hAnsi="Calibri"/>
           <w:i w:val="0"/>
-          <w:color w:val="2D3748"/>
+          <w:color w:val="2C2523"/>
           <w:sz w:val="20"/>
         </w:rPr>
-        <w:t>Khảo sát viên hoàn toàn không phải mở app bản đồ hay gõ tọa độ bằng tay. Hệ thống tự động ghi nhận và kiểm soát sai số vệ tinh.</w:t>
+        <w:t>Khảo sát viên không cần thao tác kiểm tra tọa độ hay nhập số liệu thủ công. Hệ thống tự động ghi nhận vị trí thực tế kèm theo sai số đo đạc.</w:t>
       </w:r>
     </w:p>
     <w:p>
@@ -365,10 +405,10 @@
         <w:rPr>
           <w:rFonts w:ascii="Calibri" w:hAnsi="Calibri"/>
           <w:b/>
-          <w:color w:val="2980B9"/>
+          <w:color w:val="7A5230"/>
           <w:sz w:val="23"/>
         </w:rPr>
-        <w:t>3. Cấu Trúc 6 Khung Chụp Ảnh Kỹ Thuật (Fixed Photo Slots)</w:t>
+        <w:t>3. Thiết Lập 6 Khung Chụp Ảnh Kỹ Thuật Cố Định</w:t>
       </w:r>
     </w:p>
     <w:p>
@@ -379,10 +419,10 @@
         <w:rPr>
           <w:rFonts w:ascii="Calibri" w:hAnsi="Calibri"/>
           <w:i w:val="0"/>
-          <w:color w:val="2D3748"/>
+          <w:color w:val="2C2523"/>
           <w:sz w:val="20"/>
         </w:rPr>
-        <w:t>Trong biểu mẫu, 6 nút chụp ảnh được gán mã định danh bất biến (Slot Code) tương ứng với 6 góc chụp bắt buộc:</w:t>
+        <w:t>Trong biểu mẫu, 6 vị trí chụp ảnh được gán mã kỹ thuật cố định (Slot Code) tương ứng với các hạng mục khảo sát thực địa:</w:t>
       </w:r>
     </w:p>
     <w:tbl>
@@ -391,12 +431,12 @@
         <w:jc w:val="center"/>
         <w:tblLook w:firstColumn="1" w:firstRow="1" w:lastColumn="0" w:lastRow="0" w:noHBand="0" w:noVBand="1" w:val="04A0"/>
         <w:tblBorders>
-          <w:top w:val="single" w:sz="4" w:space="0" w:color="D0D7DE"/>
-          <w:left w:val="single" w:sz="4" w:space="0" w:color="D0D7DE"/>
-          <w:bottom w:val="single" w:sz="4" w:space="0" w:color="D0D7DE"/>
-          <w:right w:val="single" w:sz="4" w:space="0" w:color="D0D7DE"/>
-          <w:insideH w:val="single" w:sz="4" w:space="0" w:color="D0D7DE"/>
-          <w:insideV w:val="single" w:sz="4" w:space="0" w:color="D0D7DE"/>
+          <w:top w:val="single" w:sz="4" w:space="0" w:color="D6CBBF"/>
+          <w:left w:val="single" w:sz="4" w:space="0" w:color="D6CBBF"/>
+          <w:bottom w:val="single" w:sz="4" w:space="0" w:color="D6CBBF"/>
+          <w:right w:val="single" w:sz="4" w:space="0" w:color="D6CBBF"/>
+          <w:insideH w:val="single" w:sz="4" w:space="0" w:color="D6CBBF"/>
+          <w:insideV w:val="single" w:sz="4" w:space="0" w:color="D6CBBF"/>
         </w:tblBorders>
       </w:tblPr>
       <w:tblGrid>
@@ -409,7 +449,7 @@
         <w:tc>
           <w:tcPr>
             <w:tcW w:type="dxa" w:w="2365"/>
-            <w:shd w:fill="003366"/>
+            <w:shd w:fill="4A3525"/>
             <w:tcMar>
               <w:top w:w="100" w:type="dxa"/>
               <w:bottom w:w="100" w:type="dxa"/>
@@ -425,14 +465,14 @@
                 <w:color w:val="FFFFFF"/>
                 <w:sz w:val="19"/>
               </w:rPr>
-              <w:t>Mã Slot</w:t>
+              <w:t>Mã Vị Trí</w:t>
             </w:r>
           </w:p>
         </w:tc>
         <w:tc>
           <w:tcPr>
             <w:tcW w:type="dxa" w:w="2365"/>
-            <w:shd w:fill="003366"/>
+            <w:shd w:fill="4A3525"/>
             <w:tcMar>
               <w:top w:w="100" w:type="dxa"/>
               <w:bottom w:w="100" w:type="dxa"/>
@@ -448,14 +488,14 @@
                 <w:color w:val="FFFFFF"/>
                 <w:sz w:val="19"/>
               </w:rPr>
-              <w:t>Tên Hiển Thị Trên Form</w:t>
+              <w:t>Tên Hạng Mục Khảo Sát</w:t>
             </w:r>
           </w:p>
         </w:tc>
         <w:tc>
           <w:tcPr>
             <w:tcW w:type="dxa" w:w="2365"/>
-            <w:shd w:fill="003366"/>
+            <w:shd w:fill="4A3525"/>
             <w:tcMar>
               <w:top w:w="100" w:type="dxa"/>
               <w:bottom w:w="100" w:type="dxa"/>
@@ -471,14 +511,14 @@
                 <w:color w:val="FFFFFF"/>
                 <w:sz w:val="19"/>
               </w:rPr>
-              <w:t>Ràng Buộc Kỹ Thuật</w:t>
+              <w:t>Tính Chất Bắt Buộc</w:t>
             </w:r>
           </w:p>
         </w:tc>
         <w:tc>
           <w:tcPr>
             <w:tcW w:type="dxa" w:w="2365"/>
-            <w:shd w:fill="003366"/>
+            <w:shd w:fill="4A3525"/>
             <w:tcMar>
               <w:top w:w="100" w:type="dxa"/>
               <w:bottom w:w="100" w:type="dxa"/>
@@ -494,7 +534,7 @@
                 <w:color w:val="FFFFFF"/>
                 <w:sz w:val="19"/>
               </w:rPr>
-              <w:t>Ý Nghĩa Đối Chiếu Báo Cáo</w:t>
+              <w:t>Mục Đích Sử Dụng Trong Báo Cáo</w:t>
             </w:r>
           </w:p>
         </w:tc>
@@ -503,7 +543,7 @@
         <w:tc>
           <w:tcPr>
             <w:tcW w:type="dxa" w:w="2365"/>
-            <w:shd w:fill="F8FAFC"/>
+            <w:shd w:fill="FAF7F2"/>
             <w:tcMar>
               <w:top w:w="80" w:type="dxa"/>
               <w:bottom w:w="80" w:type="dxa"/>
@@ -516,7 +556,7 @@
               <w:rPr>
                 <w:rFonts w:ascii="Calibri" w:hAnsi="Calibri"/>
                 <w:b/>
-                <w:color w:val="003366"/>
+                <w:color w:val="4A3525"/>
                 <w:sz w:val="19"/>
               </w:rPr>
               <w:t>A1</w:t>
@@ -526,7 +566,7 @@
         <w:tc>
           <w:tcPr>
             <w:tcW w:type="dxa" w:w="2365"/>
-            <w:shd w:fill="F8FAFC"/>
+            <w:shd w:fill="FAF7F2"/>
             <w:tcMar>
               <w:top w:w="80" w:type="dxa"/>
               <w:bottom w:w="80" w:type="dxa"/>
@@ -540,14 +580,14 @@
                 <w:rFonts w:ascii="Calibri" w:hAnsi="Calibri"/>
                 <w:sz w:val="19"/>
               </w:rPr>
-              <w:t>Hiện trạng mặt bằng xây ga</w:t>
+              <w:t>Hiện trạng mặt bằng vị trí ga</w:t>
             </w:r>
           </w:p>
         </w:tc>
         <w:tc>
           <w:tcPr>
             <w:tcW w:type="dxa" w:w="2365"/>
-            <w:shd w:fill="F8FAFC"/>
+            <w:shd w:fill="FAF7F2"/>
             <w:tcMar>
               <w:top w:w="80" w:type="dxa"/>
               <w:bottom w:w="80" w:type="dxa"/>
@@ -561,14 +601,14 @@
                 <w:rFonts w:ascii="Calibri" w:hAnsi="Calibri"/>
                 <w:sz w:val="19"/>
               </w:rPr>
-              <w:t>Bắt buộc (Required)</w:t>
+              <w:t>Bắt buộc</w:t>
             </w:r>
           </w:p>
         </w:tc>
         <w:tc>
           <w:tcPr>
             <w:tcW w:type="dxa" w:w="2365"/>
-            <w:shd w:fill="F8FAFC"/>
+            <w:shd w:fill="FAF7F2"/>
             <w:tcMar>
               <w:top w:w="80" w:type="dxa"/>
               <w:bottom w:w="80" w:type="dxa"/>
@@ -582,7 +622,7 @@
                 <w:rFonts w:ascii="Calibri" w:hAnsi="Calibri"/>
                 <w:sz w:val="19"/>
               </w:rPr>
-              <w:t>Chèn vào Chương 1 của Báo cáo (Vị trí tim ga quy hoạch)</w:t>
+              <w:t>Chèn vào Chương 1 (Vị trí tim ga quy hoạch)</w:t>
             </w:r>
           </w:p>
         </w:tc>
@@ -604,7 +644,7 @@
               <w:rPr>
                 <w:rFonts w:ascii="Calibri" w:hAnsi="Calibri"/>
                 <w:b/>
-                <w:color w:val="003366"/>
+                <w:color w:val="4A3525"/>
                 <w:sz w:val="19"/>
               </w:rPr>
               <w:t>A2</w:t>
@@ -628,7 +668,7 @@
                 <w:rFonts w:ascii="Calibri" w:hAnsi="Calibri"/>
                 <w:sz w:val="19"/>
               </w:rPr>
-              <w:t>Vỉa hè &amp; Lối tiếp cận đi bộ</w:t>
+              <w:t>Vỉa hè và lối tiếp cận đi bộ</w:t>
             </w:r>
           </w:p>
         </w:tc>
@@ -649,7 +689,7 @@
                 <w:rFonts w:ascii="Calibri" w:hAnsi="Calibri"/>
                 <w:sz w:val="19"/>
               </w:rPr>
-              <w:t>Bắt buộc (Required)</w:t>
+              <w:t>Bắt buộc</w:t>
             </w:r>
           </w:p>
         </w:tc>
@@ -679,7 +719,7 @@
         <w:tc>
           <w:tcPr>
             <w:tcW w:type="dxa" w:w="2365"/>
-            <w:shd w:fill="F8FAFC"/>
+            <w:shd w:fill="FAF7F2"/>
             <w:tcMar>
               <w:top w:w="80" w:type="dxa"/>
               <w:bottom w:w="80" w:type="dxa"/>
@@ -692,7 +732,7 @@
               <w:rPr>
                 <w:rFonts w:ascii="Calibri" w:hAnsi="Calibri"/>
                 <w:b/>
-                <w:color w:val="003366"/>
+                <w:color w:val="4A3525"/>
                 <w:sz w:val="19"/>
               </w:rPr>
               <w:t>A3</w:t>
@@ -702,7 +742,7 @@
         <w:tc>
           <w:tcPr>
             <w:tcW w:type="dxa" w:w="2365"/>
-            <w:shd w:fill="F8FAFC"/>
+            <w:shd w:fill="FAF7F2"/>
             <w:tcMar>
               <w:top w:w="80" w:type="dxa"/>
               <w:bottom w:w="80" w:type="dxa"/>
@@ -716,14 +756,14 @@
                 <w:rFonts w:ascii="Calibri" w:hAnsi="Calibri"/>
                 <w:sz w:val="19"/>
               </w:rPr>
-              <w:t>Trạm dừng xe buýt kết nối</w:t>
+              <w:t>Trạm dừng xe buýt trung chuyển</w:t>
             </w:r>
           </w:p>
         </w:tc>
         <w:tc>
           <w:tcPr>
             <w:tcW w:type="dxa" w:w="2365"/>
-            <w:shd w:fill="F8FAFC"/>
+            <w:shd w:fill="FAF7F2"/>
             <w:tcMar>
               <w:top w:w="80" w:type="dxa"/>
               <w:bottom w:w="80" w:type="dxa"/>
@@ -737,14 +777,14 @@
                 <w:rFonts w:ascii="Calibri" w:hAnsi="Calibri"/>
                 <w:sz w:val="19"/>
               </w:rPr>
-              <w:t>Bắt buộc (Required)</w:t>
+              <w:t>Bắt buộc</w:t>
             </w:r>
           </w:p>
         </w:tc>
         <w:tc>
           <w:tcPr>
             <w:tcW w:type="dxa" w:w="2365"/>
-            <w:shd w:fill="F8FAFC"/>
+            <w:shd w:fill="FAF7F2"/>
             <w:tcMar>
               <w:top w:w="80" w:type="dxa"/>
               <w:bottom w:w="80" w:type="dxa"/>
@@ -758,7 +798,7 @@
                 <w:rFonts w:ascii="Calibri" w:hAnsi="Calibri"/>
                 <w:sz w:val="19"/>
               </w:rPr>
-              <w:t>Chèn vào Chương 3 (Hiện trạng kết nối giao thông công cộng)</w:t>
+              <w:t>Chèn vào Chương 3 (Hiện trạng kết nối vận tải công cộng)</w:t>
             </w:r>
           </w:p>
         </w:tc>
@@ -780,7 +820,7 @@
               <w:rPr>
                 <w:rFonts w:ascii="Calibri" w:hAnsi="Calibri"/>
                 <w:b/>
-                <w:color w:val="003366"/>
+                <w:color w:val="4A3525"/>
                 <w:sz w:val="19"/>
               </w:rPr>
               <w:t>A4</w:t>
@@ -804,7 +844,7 @@
                 <w:rFonts w:ascii="Calibri" w:hAnsi="Calibri"/>
                 <w:sz w:val="19"/>
               </w:rPr>
-              <w:t>Bãi đỗ xe cá nhân (P&amp;R)</w:t>
+              <w:t>Bãi đỗ xe cá nhân (Park &amp; Ride)</w:t>
             </w:r>
           </w:p>
         </w:tc>
@@ -825,7 +865,7 @@
                 <w:rFonts w:ascii="Calibri" w:hAnsi="Calibri"/>
                 <w:sz w:val="19"/>
               </w:rPr>
-              <w:t>Tùy chọn (Optional)</w:t>
+              <w:t>Tùy chọn</w:t>
             </w:r>
           </w:p>
         </w:tc>
@@ -846,7 +886,7 @@
                 <w:rFonts w:ascii="Calibri" w:hAnsi="Calibri"/>
                 <w:sz w:val="19"/>
               </w:rPr>
-              <w:t>Chèn vào Chương 4 (Khu đất tiềm năng làm bãi giữ xe máy/ô tô)</w:t>
+              <w:t>Chèn vào Chương 4 (Khu đất có tiềm năng làm bãi đỗ xe)</w:t>
             </w:r>
           </w:p>
         </w:tc>
@@ -855,7 +895,7 @@
         <w:tc>
           <w:tcPr>
             <w:tcW w:type="dxa" w:w="2365"/>
-            <w:shd w:fill="F8FAFC"/>
+            <w:shd w:fill="FAF7F2"/>
             <w:tcMar>
               <w:top w:w="80" w:type="dxa"/>
               <w:bottom w:w="80" w:type="dxa"/>
@@ -868,7 +908,7 @@
               <w:rPr>
                 <w:rFonts w:ascii="Calibri" w:hAnsi="Calibri"/>
                 <w:b/>
-                <w:color w:val="003366"/>
+                <w:color w:val="4A3525"/>
                 <w:sz w:val="19"/>
               </w:rPr>
               <w:t>A5</w:t>
@@ -878,7 +918,7 @@
         <w:tc>
           <w:tcPr>
             <w:tcW w:type="dxa" w:w="2365"/>
-            <w:shd w:fill="F8FAFC"/>
+            <w:shd w:fill="FAF7F2"/>
             <w:tcMar>
               <w:top w:w="80" w:type="dxa"/>
               <w:bottom w:w="80" w:type="dxa"/>
@@ -892,14 +932,14 @@
                 <w:rFonts w:ascii="Calibri" w:hAnsi="Calibri"/>
                 <w:sz w:val="19"/>
               </w:rPr>
-              <w:t>Điểm đón trả khách (PUDO)</w:t>
+              <w:t>Điểm đón trả khách nhanh (PUDO)</w:t>
             </w:r>
           </w:p>
         </w:tc>
         <w:tc>
           <w:tcPr>
             <w:tcW w:type="dxa" w:w="2365"/>
-            <w:shd w:fill="F8FAFC"/>
+            <w:shd w:fill="FAF7F2"/>
             <w:tcMar>
               <w:top w:w="80" w:type="dxa"/>
               <w:bottom w:w="80" w:type="dxa"/>
@@ -913,14 +953,14 @@
                 <w:rFonts w:ascii="Calibri" w:hAnsi="Calibri"/>
                 <w:sz w:val="19"/>
               </w:rPr>
-              <w:t>Tùy chọn (Optional)</w:t>
+              <w:t>Tùy chọn</w:t>
             </w:r>
           </w:p>
         </w:tc>
         <w:tc>
           <w:tcPr>
             <w:tcW w:type="dxa" w:w="2365"/>
-            <w:shd w:fill="F8FAFC"/>
+            <w:shd w:fill="FAF7F2"/>
             <w:tcMar>
               <w:top w:w="80" w:type="dxa"/>
               <w:bottom w:w="80" w:type="dxa"/>
@@ -934,7 +974,7 @@
                 <w:rFonts w:ascii="Calibri" w:hAnsi="Calibri"/>
                 <w:sz w:val="19"/>
               </w:rPr>
-              <w:t>Chèn vào Chương 4 (Vị trí vịnh dừng cho Taxi / Xe ôm công nghệ)</w:t>
+              <w:t>Chèn vào Chương 4 (Vị trí bố trí vịnh dừng đón/trả khách)</w:t>
             </w:r>
           </w:p>
         </w:tc>
@@ -956,7 +996,7 @@
               <w:rPr>
                 <w:rFonts w:ascii="Calibri" w:hAnsi="Calibri"/>
                 <w:b/>
-                <w:color w:val="003366"/>
+                <w:color w:val="4A3525"/>
                 <w:sz w:val="19"/>
               </w:rPr>
               <w:t>A6</w:t>
@@ -980,7 +1020,7 @@
                 <w:rFonts w:ascii="Calibri" w:hAnsi="Calibri"/>
                 <w:sz w:val="19"/>
               </w:rPr>
-              <w:t>Chướng ngại vật &amp; Rào cản</w:t>
+              <w:t>Chướng ngại vật và điểm lấn chiếm</w:t>
             </w:r>
           </w:p>
         </w:tc>
@@ -1001,7 +1041,7 @@
                 <w:rFonts w:ascii="Calibri" w:hAnsi="Calibri"/>
                 <w:sz w:val="19"/>
               </w:rPr>
-              <w:t>Tùy chọn (Optional)</w:t>
+              <w:t>Tùy chọn</w:t>
             </w:r>
           </w:p>
         </w:tc>
@@ -1022,7 +1062,7 @@
                 <w:rFonts w:ascii="Calibri" w:hAnsi="Calibri"/>
                 <w:sz w:val="19"/>
               </w:rPr>
-              <w:t>Chèn vào Chương 5 (Cột điện, cây xanh, miệng cống, lấn chiếm)</w:t>
+              <w:t>Chèn vào Chương 5 (Cột điện, cây xanh lớn, điểm nghẽn giao thông)</w:t>
             </w:r>
           </w:p>
         </w:tc>
@@ -1042,10 +1082,10 @@
         <w:rPr>
           <w:rFonts w:ascii="Calibri" w:hAnsi="Calibri"/>
           <w:b/>
-          <w:color w:val="003366"/>
-          <w:sz w:val="26"/>
+          <w:color w:val="4A3525"/>
+          <w:sz w:val="27"/>
         </w:rPr>
-        <w:t>III. CHI TIẾT CƠ CHẾ XỬ LÝ BƯỚC 2: MÃ HÓA, NÉN ẢNH &amp; WATERMARK</w:t>
+        <w:t>III. CHI TIẾT CƠ CHẾ XỬ LÝ BƯỚC 2: MÃ HÓA, NÉN ẢNH VÀ WATERMARK</w:t>
       </w:r>
     </w:p>
     <w:p>
@@ -1056,10 +1096,10 @@
         <w:rPr>
           <w:rFonts w:ascii="Calibri" w:hAnsi="Calibri"/>
           <w:i w:val="0"/>
-          <w:color w:val="2D3748"/>
+          <w:color w:val="2C2523"/>
           <w:sz w:val="20"/>
         </w:rPr>
-        <w:t>Khi khảo sát viên chọn file hoặc chụp trực tiếp từ camera, sự kiện onchange kích hoạt hàm xử lý ảnh ngầm trên trình duyệt qua chuỗi 3 thuật toán liên tiếp:</w:t>
+        <w:t>Khi người dùng chụp ảnh hoặc tải tệp lên tại từng khung khảo sát, ứng dụng sẽ thực thi đồng thời ba thuật toán xử lý nội bộ:</w:t>
       </w:r>
     </w:p>
     <w:p>
@@ -1071,10 +1111,10 @@
         <w:rPr>
           <w:rFonts w:ascii="Calibri" w:hAnsi="Calibri"/>
           <w:b/>
-          <w:color w:val="2980B9"/>
+          <w:color w:val="7A5230"/>
           <w:sz w:val="23"/>
         </w:rPr>
-        <w:t>1. Thuật Toán Tự Động Đổi Tên Ảnh (Auto-Naming Algorithm)</w:t>
+        <w:t>1. Thuật Toán Tự Động Định Danh Tệp Ảnh (Auto-Naming Algorithm)</w:t>
       </w:r>
     </w:p>
     <w:p>
@@ -1085,10 +1125,10 @@
         <w:rPr>
           <w:rFonts w:ascii="Calibri" w:hAnsi="Calibri"/>
           <w:i w:val="0"/>
-          <w:color w:val="2D3748"/>
+          <w:color w:val="2C2523"/>
           <w:sz w:val="20"/>
         </w:rPr>
-        <w:t>Để triệt tiêu tình trạng file ảnh bị đặt tên vô nghĩa (như IMG_20260912_...jpg hoặc mã hash Zalo), hệ thống sinh tên file mới ngay tại bộ nhớ RAM:</w:t>
+        <w:t>Hệ thống loại bỏ tên ảnh mặc định của thiết bị (dạng 'IMG_2026.jpg' hoặc mã số ngẫu nhiên) và khởi tạo tên tệp theo quy chuẩn thống nhất:</w:t>
       </w:r>
     </w:p>
     <w:tbl>
@@ -1104,7 +1144,7 @@
         <w:tc>
           <w:tcPr>
             <w:tcW w:type="dxa" w:w="9461"/>
-            <w:shd w:fill="F1F5F9"/>
+            <w:shd w:fill="F4EFE6"/>
             <w:tcMar>
               <w:top w:w="80" w:type="dxa"/>
               <w:bottom w:w="80" w:type="dxa"/>
@@ -1112,10 +1152,10 @@
               <w:right w:w="120" w:type="dxa"/>
             </w:tcMar>
             <w:tcBorders>
-              <w:top w:val="single" w:sz="4" w:space="0" w:color="CBD5E1"/>
-              <w:left w:val="single" w:sz="18" w:space="0" w:color="003366"/>
-              <w:bottom w:val="single" w:sz="4" w:space="0" w:color="CBD5E1"/>
-              <w:right w:val="single" w:sz="4" w:space="0" w:color="CBD5E1"/>
+              <w:top w:val="single" w:sz="4" w:space="0" w:color="D6CBBF"/>
+              <w:left w:val="single" w:sz="18" w:space="0" w:color="4A3525"/>
+              <w:bottom w:val="single" w:sz="4" w:space="0" w:color="D6CBBF"/>
+              <w:right w:val="single" w:sz="4" w:space="0" w:color="D6CBBF"/>
             </w:tcBorders>
           </w:tcPr>
           <w:p>
@@ -1125,22 +1165,22 @@
             <w:r>
               <w:rPr>
                 <w:rFonts w:ascii="Consolas" w:hAnsi="Consolas"/>
-                <w:color w:val="1E293B"/>
+                <w:color w:val="3C2D23"/>
                 <w:sz w:val="17"/>
               </w:rPr>
               <w:t>function generateCleanFileName(stationId, slotCode, timestamp) {</w:t>
               <w:br/>
-              <w:t xml:space="preserve">    // Chuyển timestamp về chuỗi YYYYMMDD_HHmmss</w:t>
+              <w:t xml:space="preserve">    // Chuyển đổi thời gian thành chuỗi YYYYMMDD_HHmmss</w:t>
               <w:br/>
               <w:t xml:space="preserve">    const dateStr = timestamp.toISOString().replace(/[-:T]/g, '').slice(0, 15);</w:t>
               <w:br/>
-              <w:t xml:space="preserve">    // Công thức bất biến: [MÃ_GA]_[MÃ_SLOT]_[TIMESTAMP].jpg</w:t>
+              <w:t xml:space="preserve">    // Quy chuẩn định danh: [Mã_Ga]_[Mã_Vị_Trí]_[Thời_Gian].jpg</w:t>
               <w:br/>
               <w:t xml:space="preserve">    return `${stationId}_${slotCode}_${dateStr}.jpg`;</w:t>
               <w:br/>
               <w:t>}</w:t>
               <w:br/>
-              <w:t>// Kết quả đầu ra chuẩn mực: S1_A1_20260912_143025.jpg</w:t>
+              <w:t>// Kết quả định danh chuẩn: S1_A1_20260912_143025.jpg</w:t>
             </w:r>
           </w:p>
         </w:tc>
@@ -1153,50 +1193,66 @@
     </w:p>
     <w:p>
       <w:pPr>
-        <w:pStyle w:val="ListBullet"/>
         <w:spacing w:before="20" w:after="40" w:line="276" w:lineRule="auto"/>
-        <w:ind w:left="360"/>
+        <w:ind w:left="288"/>
       </w:pPr>
       <w:r>
         <w:rPr>
           <w:rFonts w:ascii="Calibri" w:hAnsi="Calibri"/>
           <w:b/>
-          <w:color w:val="2D3748"/>
+          <w:color w:val="7A5230"/>
           <w:sz w:val="20"/>
         </w:rPr>
-        <w:t xml:space="preserve">Quy tắc an toàn: </w:t>
+        <w:t xml:space="preserve">–  </w:t>
       </w:r>
       <w:r>
         <w:rPr>
           <w:rFonts w:ascii="Calibri" w:hAnsi="Calibri"/>
-          <w:color w:val="2D3748"/>
+          <w:b/>
+          <w:color w:val="2C2523"/>
           <w:sz w:val="20"/>
         </w:rPr>
-        <w:t>Tên file ngắn gọn, không dấu tiếng Việt, không chứa khoảng trắng hay ký tự đặc biệt.</w:t>
+        <w:t xml:space="preserve">Đặc tính quy chuẩn: </w:t>
+      </w:r>
+      <w:r>
+        <w:rPr>
+          <w:rFonts w:ascii="Calibri" w:hAnsi="Calibri"/>
+          <w:color w:val="2C2523"/>
+          <w:sz w:val="20"/>
+        </w:rPr>
+        <w:t>Tên tệp ngắn gọn, không sử dụng dấu tiếng Việt, không chứa khoảng trắng hay ký tự đặc biệt.</w:t>
       </w:r>
     </w:p>
     <w:p>
       <w:pPr>
-        <w:pStyle w:val="ListBullet"/>
         <w:spacing w:before="20" w:after="40" w:line="276" w:lineRule="auto"/>
-        <w:ind w:left="360"/>
+        <w:ind w:left="288"/>
       </w:pPr>
       <w:r>
         <w:rPr>
           <w:rFonts w:ascii="Calibri" w:hAnsi="Calibri"/>
           <w:b/>
-          <w:color w:val="2D3748"/>
+          <w:color w:val="7A5230"/>
           <w:sz w:val="20"/>
         </w:rPr>
-        <w:t xml:space="preserve">Tính tường minh: </w:t>
+        <w:t xml:space="preserve">–  </w:t>
       </w:r>
       <w:r>
         <w:rPr>
           <w:rFonts w:ascii="Calibri" w:hAnsi="Calibri"/>
-          <w:color w:val="2D3748"/>
+          <w:b/>
+          <w:color w:val="2C2523"/>
           <w:sz w:val="20"/>
         </w:rPr>
-        <w:t>Khi nhìn vào tên file, cả con người và máy tính đều biết ngay bức ảnh này chụp tại Ga nào (S1), chụp hạng mục gì (A1) và chụp lúc nào.</w:t>
+        <w:t xml:space="preserve">Khả năng nhận diện: </w:t>
+      </w:r>
+      <w:r>
+        <w:rPr>
+          <w:rFonts w:ascii="Calibri" w:hAnsi="Calibri"/>
+          <w:color w:val="2C2523"/>
+          <w:sz w:val="20"/>
+        </w:rPr>
+        <w:t>Nhìn vào tên tệp có thể xác định chính xác ảnh thuộc nhà ga nào (S1), chụp hạng mục nào (A1) và thời điểm thực hiện.</w:t>
       </w:r>
     </w:p>
     <w:p>
@@ -1208,10 +1264,10 @@
         <w:rPr>
           <w:rFonts w:ascii="Calibri" w:hAnsi="Calibri"/>
           <w:b/>
-          <w:color w:val="2980B9"/>
+          <w:color w:val="7A5230"/>
           <w:sz w:val="23"/>
         </w:rPr>
-        <w:t>2. Thuật Toán Nén Ảnh Tại Máy Khách (Client-Side Compression)</w:t>
+        <w:t>2. Thuật Toán Tối Ưu Dung Lượng Ảnh Tại Thiết Bị (Client-Side Compression)</w:t>
       </w:r>
     </w:p>
     <w:p>
@@ -1222,96 +1278,106 @@
         <w:rPr>
           <w:rFonts w:ascii="Calibri" w:hAnsi="Calibri"/>
           <w:i w:val="0"/>
-          <w:color w:val="2D3748"/>
+          <w:color w:val="2C2523"/>
           <w:sz w:val="20"/>
         </w:rPr>
-        <w:t>Điện thoại thông minh hiện nay chụp ảnh có độ phân giải rất cao (từ 12MP đến 48MP, dung lượng 5MB – 12MB/ảnh). Nếu nộp cả 6 bức ảnh gốc qua mạng 4G, tổng dung lượng lên đến 40MB – 60MB, gây ra lỗi timeout hoặc đứng app.</w:t>
+        <w:t>Ảnh chụp trực tiếp từ điện thoại thông minh hiện nay có độ phân giải từ 12MP đến 48MP với dung lượng từ 5MB đến 12MB cho mỗi tệp. Việc gửi 6 ảnh nguyên bản qua mạng di động dễ gây hiện tượng chậm trễ hoặc lỗi kết nối:</w:t>
       </w:r>
     </w:p>
     <w:p>
       <w:pPr>
-        <w:spacing w:before="40" w:after="80" w:line="276" w:lineRule="auto"/>
-      </w:pPr>
-      <w:r>
-        <w:rPr>
-          <w:rFonts w:ascii="Calibri" w:hAnsi="Calibri"/>
-          <w:i w:val="0"/>
-          <w:color w:val="2D3748"/>
-          <w:sz w:val="20"/>
-        </w:rPr>
-        <w:t>Giải pháp kỹ thuật sử dụng HTML5 Canvas để co kích thước và nén chất lượng:</w:t>
-      </w:r>
-    </w:p>
-    <w:p>
-      <w:pPr>
-        <w:pStyle w:val="ListBullet"/>
         <w:spacing w:before="20" w:after="40" w:line="276" w:lineRule="auto"/>
-        <w:ind w:left="360"/>
+        <w:ind w:left="288"/>
       </w:pPr>
       <w:r>
         <w:rPr>
           <w:rFonts w:ascii="Calibri" w:hAnsi="Calibri"/>
           <w:b/>
-          <w:color w:val="2D3748"/>
+          <w:color w:val="7A5230"/>
           <w:sz w:val="20"/>
         </w:rPr>
-        <w:t xml:space="preserve">Co tỷ lệ: </w:t>
+        <w:t xml:space="preserve">–  </w:t>
       </w:r>
       <w:r>
         <w:rPr>
           <w:rFonts w:ascii="Calibri" w:hAnsi="Calibri"/>
-          <w:color w:val="2D3748"/>
+          <w:b/>
+          <w:color w:val="2C2523"/>
           <w:sz w:val="20"/>
         </w:rPr>
-        <w:t>Giới hạn chiều dài nhất (Max Dimension) của bức ảnh là 1920px (chuẩn Full HD).</w:t>
+        <w:t xml:space="preserve">Điều chỉnh kích thước: </w:t>
+      </w:r>
+      <w:r>
+        <w:rPr>
+          <w:rFonts w:ascii="Calibri" w:hAnsi="Calibri"/>
+          <w:color w:val="2C2523"/>
+          <w:sz w:val="20"/>
+        </w:rPr>
+        <w:t>Ảnh được điều chỉnh kích thước về cạnh dài tối đa 1920px (chuẩn Full HD) thông qua Canvas.</w:t>
       </w:r>
     </w:p>
     <w:p>
       <w:pPr>
-        <w:pStyle w:val="ListBullet"/>
         <w:spacing w:before="20" w:after="40" w:line="276" w:lineRule="auto"/>
-        <w:ind w:left="360"/>
+        <w:ind w:left="288"/>
       </w:pPr>
       <w:r>
         <w:rPr>
           <w:rFonts w:ascii="Calibri" w:hAnsi="Calibri"/>
           <w:b/>
-          <w:color w:val="2D3748"/>
+          <w:color w:val="7A5230"/>
           <w:sz w:val="20"/>
         </w:rPr>
-        <w:t xml:space="preserve">Bảo toàn hình ảnh: </w:t>
+        <w:t xml:space="preserve">–  </w:t>
       </w:r>
       <w:r>
         <w:rPr>
           <w:rFonts w:ascii="Calibri" w:hAnsi="Calibri"/>
-          <w:color w:val="2D3748"/>
+          <w:b/>
+          <w:color w:val="2C2523"/>
           <w:sz w:val="20"/>
         </w:rPr>
-        <w:t>Tính toán tỷ lệ Aspect Ratio để ảnh không bao giờ bị méo hình (bảo toàn tỷ lệ gốc).</w:t>
+        <w:t xml:space="preserve">Bảo toàn tỷ lệ: </w:t>
+      </w:r>
+      <w:r>
+        <w:rPr>
+          <w:rFonts w:ascii="Calibri" w:hAnsi="Calibri"/>
+          <w:color w:val="2C2523"/>
+          <w:sz w:val="20"/>
+        </w:rPr>
+        <w:t>Tỷ lệ khung hình gốc (Aspect Ratio) được giữ nguyên để bảo đảm ảnh không bị méo mó.</w:t>
       </w:r>
     </w:p>
     <w:p>
       <w:pPr>
-        <w:pStyle w:val="ListBullet"/>
         <w:spacing w:before="20" w:after="40" w:line="276" w:lineRule="auto"/>
-        <w:ind w:left="360"/>
+        <w:ind w:left="288"/>
       </w:pPr>
       <w:r>
         <w:rPr>
           <w:rFonts w:ascii="Calibri" w:hAnsi="Calibri"/>
           <w:b/>
-          <w:color w:val="2D3748"/>
+          <w:color w:val="7A5230"/>
           <w:sz w:val="20"/>
         </w:rPr>
-        <w:t xml:space="preserve">Chất lượng tối ưu: </w:t>
+        <w:t xml:space="preserve">–  </w:t>
       </w:r>
       <w:r>
         <w:rPr>
           <w:rFonts w:ascii="Calibri" w:hAnsi="Calibri"/>
-          <w:color w:val="2D3748"/>
+          <w:b/>
+          <w:color w:val="2C2523"/>
           <w:sz w:val="20"/>
         </w:rPr>
-        <w:t>Xuất ảnh dưới định dạng image/jpeg với hệ số nén Quality = 0.82. Đây là 'điểm vàng' giữa chất lượng và dung lượng: mắt thường không phân biệt được với ảnh gốc, nhưng dung lượng giảm từ 8MB xuống chỉ còn 600KB - 800KB!</w:t>
+        <w:t xml:space="preserve">Mức nén tối ưu: </w:t>
+      </w:r>
+      <w:r>
+        <w:rPr>
+          <w:rFonts w:ascii="Calibri" w:hAnsi="Calibri"/>
+          <w:color w:val="2C2523"/>
+          <w:sz w:val="20"/>
+        </w:rPr>
+        <w:t>Ảnh xuất ra định dạng JPEG với hệ số nén chất lượng 0.82. Mức này bảo toàn độ rõ nét của biển báo, hiện trạng mặt đường trong khi giảm dung lượng từ 8MB xuống khoảng 600KB – 800KB.</w:t>
       </w:r>
     </w:p>
     <w:p>
@@ -1323,10 +1389,10 @@
         <w:rPr>
           <w:rFonts w:ascii="Calibri" w:hAnsi="Calibri"/>
           <w:b/>
-          <w:color w:val="2980B9"/>
+          <w:color w:val="7A5230"/>
           <w:sz w:val="23"/>
         </w:rPr>
-        <w:t>3. Thuật Toán Đóng Dấu Watermark Tọa Độ &amp; Thời Gian (Proof Overlay)</w:t>
+        <w:t>3. Thuật Toán Đóng Dấu Thông Tin Thực Địa Lên Ảnh (Watermarking)</w:t>
       </w:r>
     </w:p>
     <w:p>
@@ -1337,10 +1403,10 @@
         <w:rPr>
           <w:rFonts w:ascii="Calibri" w:hAnsi="Calibri"/>
           <w:i w:val="0"/>
-          <w:color w:val="2D3748"/>
+          <w:color w:val="2C2523"/>
           <w:sz w:val="20"/>
         </w:rPr>
-        <w:t>Để đảm bảo tính pháp lý và độ tin cậy của dữ liệu khảo sát (chứng minh khảo sát viên thực sự có mặt tại hiện trường đúng thời điểm), Canvas tự động vẽ một thanh băng đen mờ ở cạnh đáy bức ảnh:</w:t>
+        <w:t>Nhằm bảo đảm tính xác thực của dữ liệu khảo sát (xác nhận việc khảo sát được thực hiện tại hiện trường đúng thời điểm), ứng dụng tự động in dải thông tin định danh ở cạnh đáy bức ảnh:</w:t>
       </w:r>
     </w:p>
     <w:tbl>
@@ -1356,7 +1422,7 @@
         <w:tc>
           <w:tcPr>
             <w:tcW w:type="dxa" w:w="9461"/>
-            <w:shd w:fill="F1F5F9"/>
+            <w:shd w:fill="F4EFE6"/>
             <w:tcMar>
               <w:top w:w="80" w:type="dxa"/>
               <w:bottom w:w="80" w:type="dxa"/>
@@ -1364,10 +1430,10 @@
               <w:right w:w="120" w:type="dxa"/>
             </w:tcMar>
             <w:tcBorders>
-              <w:top w:val="single" w:sz="4" w:space="0" w:color="CBD5E1"/>
-              <w:left w:val="single" w:sz="18" w:space="0" w:color="003366"/>
-              <w:bottom w:val="single" w:sz="4" w:space="0" w:color="CBD5E1"/>
-              <w:right w:val="single" w:sz="4" w:space="0" w:color="CBD5E1"/>
+              <w:top w:val="single" w:sz="4" w:space="0" w:color="D6CBBF"/>
+              <w:left w:val="single" w:sz="18" w:space="0" w:color="4A3525"/>
+              <w:bottom w:val="single" w:sz="4" w:space="0" w:color="D6CBBF"/>
+              <w:right w:val="single" w:sz="4" w:space="0" w:color="D6CBBF"/>
             </w:tcBorders>
           </w:tcPr>
           <w:p>
@@ -1377,15 +1443,15 @@
             <w:r>
               <w:rPr>
                 <w:rFonts w:ascii="Consolas" w:hAnsi="Consolas"/>
-                <w:color w:val="1E293B"/>
+                <w:color w:val="3C2D23"/>
                 <w:sz w:val="17"/>
               </w:rPr>
-              <w:t>// Thuật toán vẽ Watermark lên Canvas</w:t>
+              <w:t>// Thuật toán ghi thông tin Watermark lên Canvas</w:t>
               <w:br/>
               <w:t>const ctx = canvas.getContext('2d');</w:t>
               <w:br/>
               <w:br/>
-              <w:t>// 1. Vẽ dải băng đen mờ (Chiều cao 60px)</w:t>
+              <w:t>// 1. Tạo dải nền bán trong suốt ở đáy ảnh (chiều cao tương ứng 5% ảnh)</w:t>
               <w:br/>
               <w:t>const bannerHeight = Math.max(50, canvas.height * 0.05);</w:t>
               <w:br/>
@@ -1394,7 +1460,7 @@
               <w:t>ctx.fillRect(0, canvas.height - bannerHeight, canvas.width, bannerHeight);</w:t>
               <w:br/>
               <w:br/>
-              <w:t>// 2. Định dạng chữ Watermark sắc nét</w:t>
+              <w:t>// 2. Thiết lập định dạng chữ hiển thị</w:t>
               <w:br/>
               <w:t>ctx.fillStyle = '#FFFFFF';</w:t>
               <w:br/>
@@ -1403,7 +1469,7 @@
               <w:t>ctx.textBaseline = 'middle';</w:t>
               <w:br/>
               <w:br/>
-              <w:t>// 3. In thông tin định danh và tọa độ vệ tinh</w:t>
+              <w:t>// 3. Ghi thông tin trạm và tọa độ GPS thu nhận</w:t>
               <w:br/>
               <w:t>const line1 = `📍 ${stationName.toUpperCase()} | HẠNG MỤC: ${slotName}`;</w:t>
               <w:br/>
@@ -1436,7 +1502,7 @@
         <w:tc>
           <w:tcPr>
             <w:tcW w:type="dxa" w:w="9461"/>
-            <w:shd w:fill="F0F4F8"/>
+            <w:shd w:fill="F7F3ED"/>
             <w:tcMar>
               <w:top w:w="100" w:type="dxa"/>
               <w:bottom w:w="100" w:type="dxa"/>
@@ -1445,7 +1511,7 @@
             </w:tcMar>
             <w:tcBorders>
               <w:top w:val="none"/>
-              <w:left w:val="single" w:sz="20" w:space="0" w:color="003366"/>
+              <w:left w:val="single" w:sz="20" w:space="0" w:color="4A3525"/>
               <w:bottom w:val="none"/>
               <w:right w:val="none"/>
             </w:tcBorders>
@@ -1458,18 +1524,18 @@
               <w:rPr>
                 <w:rFonts w:ascii="Calibri" w:hAnsi="Calibri"/>
                 <w:b/>
-                <w:color w:val="003366"/>
+                <w:color w:val="4A3525"/>
                 <w:sz w:val="20"/>
               </w:rPr>
-              <w:t xml:space="preserve">📌 HIỆU QUẢ CỦA BƯỚC 2: </w:t>
+              <w:t xml:space="preserve">■ KẾT QUẢ XỬ LÝ BƯỚC 2: </w:t>
             </w:r>
             <w:r>
               <w:rPr>
                 <w:rFonts w:ascii="Calibri" w:hAnsi="Calibri"/>
-                <w:color w:val="2D3748"/>
+                <w:color w:val="2C2523"/>
                 <w:sz w:val="19"/>
               </w:rPr>
-              <w:t>Sau khi hoàn tất Bước 2, bức ảnh gốc nặng 8MB có tên 'IMG_2026.jpg' đã biến thành bức ảnh 'S1_A1_20260912_143025.jpg' nặng 700KB, trên góc ảnh in sẵn tọa độ GPS và thời gian. Toàn bộ quá trình này diễn ra trên máy khách trong đúng 0.3 giây mà không cần mạng Internet!</w:t>
+              <w:t>Sau khi xử lý qua Bước 2, tệp ảnh gốc dung lượng lớn được chuyển đổi thành tệp định danh chuẩn 'S1_A1_20260912_143025.jpg' dung lượng xấp xỉ 700KB, đồng thời in sẵn thông tin tọa độ và thời gian thực. Toàn bộ thao tác xử lý hoàn tất trong khoảng 0.3 giây ngay trên thiết bị mà không cần kết nối Internet.</w:t>
             </w:r>
           </w:p>
         </w:tc>
@@ -1489,10 +1555,10 @@
         <w:rPr>
           <w:rFonts w:ascii="Calibri" w:hAnsi="Calibri"/>
           <w:b/>
-          <w:color w:val="003366"/>
-          <w:sz w:val="26"/>
+          <w:color w:val="4A3525"/>
+          <w:sz w:val="27"/>
         </w:rPr>
-        <w:t>IV. CƠ CHẾ ĐÓNG GÓI DỮ LIỆU &amp; CHẠY OFFLINE KHI MẤT MẠNG</w:t>
+        <w:t>IV. CƠ CHẾ LƯU TRỮ NGOẠI TUYẾN KHI MẤT SÓNG DI ĐỘNG</w:t>
       </w:r>
     </w:p>
     <w:p>
@@ -1503,82 +1569,106 @@
         <w:rPr>
           <w:rFonts w:ascii="Calibri" w:hAnsi="Calibri"/>
           <w:i w:val="0"/>
-          <w:color w:val="2D3748"/>
+          <w:color w:val="2C2523"/>
           <w:sz w:val="20"/>
         </w:rPr>
-        <w:t>Khi khảo sát viên khảo sát tại các vị trí không có sóng 4G (nhà ga ngầm, hầm chui), ứng dụng kích hoạt chế độ **Offline-First Resilience**:</w:t>
+        <w:t>Tại các vị trí khảo sát không có sóng mạng 4G (khu vực ngầm hoặc tầng hầm), hệ thống kích hoạt cơ chế lưu trữ tạm thời (Offline-First):</w:t>
       </w:r>
     </w:p>
     <w:p>
       <w:pPr>
-        <w:pStyle w:val="ListBullet"/>
         <w:spacing w:before="20" w:after="40" w:line="276" w:lineRule="auto"/>
-        <w:ind w:left="360"/>
+        <w:ind w:left="288"/>
       </w:pPr>
       <w:r>
         <w:rPr>
           <w:rFonts w:ascii="Calibri" w:hAnsi="Calibri"/>
           <w:b/>
-          <w:color w:val="2D3748"/>
+          <w:color w:val="7A5230"/>
           <w:sz w:val="20"/>
         </w:rPr>
-        <w:t xml:space="preserve">Lưu tạm trên máy: </w:t>
+        <w:t xml:space="preserve">–  </w:t>
       </w:r>
       <w:r>
         <w:rPr>
           <w:rFonts w:ascii="Calibri" w:hAnsi="Calibri"/>
-          <w:color w:val="2D3748"/>
+          <w:b/>
+          <w:color w:val="2C2523"/>
           <w:sz w:val="20"/>
         </w:rPr>
-        <w:t>Phiếu khảo sát và toàn bộ chuỗi Base64 của 6 bức ảnh đã nén được lưu trữ trực tiếp vào IndexedDB của trình duyệt điện thoại.</w:t>
+        <w:t xml:space="preserve">Lưu tạm trên thiết bị: </w:t>
+      </w:r>
+      <w:r>
+        <w:rPr>
+          <w:rFonts w:ascii="Calibri" w:hAnsi="Calibri"/>
+          <w:color w:val="2C2523"/>
+          <w:sz w:val="20"/>
+        </w:rPr>
+        <w:t>Dữ liệu phiếu khảo sát và chuỗi dữ liệu ảnh đã qua xử lý được lưu trữ an toàn trong bộ nhớ cục bộ (IndexedDB) của thiết bị.</w:t>
       </w:r>
     </w:p>
     <w:p>
       <w:pPr>
-        <w:pStyle w:val="ListBullet"/>
         <w:spacing w:before="20" w:after="40" w:line="276" w:lineRule="auto"/>
-        <w:ind w:left="360"/>
+        <w:ind w:left="288"/>
       </w:pPr>
       <w:r>
         <w:rPr>
           <w:rFonts w:ascii="Calibri" w:hAnsi="Calibri"/>
           <w:b/>
-          <w:color w:val="2D3748"/>
+          <w:color w:val="7A5230"/>
           <w:sz w:val="20"/>
         </w:rPr>
-        <w:t xml:space="preserve">Trải nghiệm không gián đoạn: </w:t>
+        <w:t xml:space="preserve">–  </w:t>
       </w:r>
       <w:r>
         <w:rPr>
           <w:rFonts w:ascii="Calibri" w:hAnsi="Calibri"/>
-          <w:color w:val="2D3748"/>
+          <w:b/>
+          <w:color w:val="2C2523"/>
           <w:sz w:val="20"/>
         </w:rPr>
-        <w:t>Giao diện thông báo: 'Đã lưu cục bộ vào máy (Chờ kết nối mạng)'. Khảo sát viên tiếp tục di chuyển sang các ga khác khảo sát bình thường.</w:t>
+        <w:t xml:space="preserve">Duy trì khảo sát: </w:t>
+      </w:r>
+      <w:r>
+        <w:rPr>
+          <w:rFonts w:ascii="Calibri" w:hAnsi="Calibri"/>
+          <w:color w:val="2C2523"/>
+          <w:sz w:val="20"/>
+        </w:rPr>
+        <w:t>Ứng dụng thông báo trạng thái 'Đã lưu tạm trên thiết bị'. Khảo sát viên có thể tiếp tục công việc tại các điểm tiếp theo mà không bị gián đoạn.</w:t>
       </w:r>
     </w:p>
     <w:p>
       <w:pPr>
-        <w:pStyle w:val="ListBullet"/>
         <w:spacing w:before="20" w:after="40" w:line="276" w:lineRule="auto"/>
-        <w:ind w:left="360"/>
+        <w:ind w:left="288"/>
       </w:pPr>
       <w:r>
         <w:rPr>
           <w:rFonts w:ascii="Calibri" w:hAnsi="Calibri"/>
           <w:b/>
-          <w:color w:val="2D3748"/>
+          <w:color w:val="7A5230"/>
           <w:sz w:val="20"/>
         </w:rPr>
-        <w:t xml:space="preserve">Tự động đồng bộ (Auto-Sync): </w:t>
+        <w:t xml:space="preserve">–  </w:t>
       </w:r>
       <w:r>
         <w:rPr>
           <w:rFonts w:ascii="Calibri" w:hAnsi="Calibri"/>
-          <w:color w:val="2D3748"/>
+          <w:b/>
+          <w:color w:val="2C2523"/>
           <w:sz w:val="20"/>
         </w:rPr>
-        <w:t>Khi điện thoại kết nối lại mạng 4G/Wifi, Service Worker ngầm lập tức đẩy toàn bộ các phiếu tồn đọng lên máy chủ một cách an toàn mà không bị mất dữ liệu.</w:t>
+        <w:t xml:space="preserve">Tự động đồng bộ: </w:t>
+      </w:r>
+      <w:r>
+        <w:rPr>
+          <w:rFonts w:ascii="Calibri" w:hAnsi="Calibri"/>
+          <w:color w:val="2C2523"/>
+          <w:sz w:val="20"/>
+        </w:rPr>
+        <w:t>Khi thiết bị nhận lại tín hiệu mạng, hệ thống tự động đồng bộ ngầm các dữ liệu đã lưu lên máy chủ mà không đòi hỏi thao tác gửi lại.</w:t>
       </w:r>
     </w:p>
     <w:p>
@@ -1590,10 +1680,10 @@
         <w:rPr>
           <w:rFonts w:ascii="Calibri" w:hAnsi="Calibri"/>
           <w:b/>
-          <w:color w:val="003366"/>
-          <w:sz w:val="26"/>
+          <w:color w:val="4A3525"/>
+          <w:sz w:val="27"/>
         </w:rPr>
-        <w:t>V. CẤU TRÚC GÓI TIN DỮ LIỆU HOÀN CHỈNH (PAYLOAD SCHEMA)</w:t>
+        <w:t>V. ĐẶC TẢ CẤU TRÚC GÓI DỮ LIỆU HOÀN CHỈNH (PAYLOAD SCHEMA)</w:t>
       </w:r>
     </w:p>
     <w:p>
@@ -1604,10 +1694,10 @@
         <w:rPr>
           <w:rFonts w:ascii="Calibri" w:hAnsi="Calibri"/>
           <w:i w:val="0"/>
-          <w:color w:val="2D3748"/>
+          <w:color w:val="2C2523"/>
           <w:sz w:val="20"/>
         </w:rPr>
-        <w:t>Dữ liệu sau khi kết thúc Bước 1 và Bước 2 được đóng gói thành một đối tượng JSON chuẩn mực sẵn sàng gửi lên Server:</w:t>
+        <w:t>Sau khi hoàn tất Bước 1 và Bước 2, dữ liệu được tổng hợp thành đối tượng chuẩn dạng JSON để truyền về máy chủ:</w:t>
       </w:r>
     </w:p>
     <w:tbl>
@@ -1623,7 +1713,7 @@
         <w:tc>
           <w:tcPr>
             <w:tcW w:type="dxa" w:w="9461"/>
-            <w:shd w:fill="F1F5F9"/>
+            <w:shd w:fill="F4EFE6"/>
             <w:tcMar>
               <w:top w:w="80" w:type="dxa"/>
               <w:bottom w:w="80" w:type="dxa"/>
@@ -1631,10 +1721,10 @@
               <w:right w:w="120" w:type="dxa"/>
             </w:tcMar>
             <w:tcBorders>
-              <w:top w:val="single" w:sz="4" w:space="0" w:color="CBD5E1"/>
-              <w:left w:val="single" w:sz="18" w:space="0" w:color="003366"/>
-              <w:bottom w:val="single" w:sz="4" w:space="0" w:color="CBD5E1"/>
-              <w:right w:val="single" w:sz="4" w:space="0" w:color="CBD5E1"/>
+              <w:top w:val="single" w:sz="4" w:space="0" w:color="D6CBBF"/>
+              <w:left w:val="single" w:sz="18" w:space="0" w:color="4A3525"/>
+              <w:bottom w:val="single" w:sz="4" w:space="0" w:color="D6CBBF"/>
+              <w:right w:val="single" w:sz="4" w:space="0" w:color="D6CBBF"/>
             </w:tcBorders>
           </w:tcPr>
           <w:p>
@@ -1644,7 +1734,7 @@
             <w:r>
               <w:rPr>
                 <w:rFonts w:ascii="Consolas" w:hAnsi="Consolas"/>
-                <w:color w:val="1E293B"/>
+                <w:color w:val="3C2D23"/>
                 <w:sz w:val="17"/>
               </w:rPr>
               <w:t>{</w:t>
@@ -1741,7 +1831,7 @@
         <w:tc>
           <w:tcPr>
             <w:tcW w:type="dxa" w:w="9461"/>
-            <w:shd w:fill="F0F4F8"/>
+            <w:shd w:fill="F7F3ED"/>
             <w:tcMar>
               <w:top w:w="100" w:type="dxa"/>
               <w:bottom w:w="100" w:type="dxa"/>
@@ -1750,7 +1840,7 @@
             </w:tcMar>
             <w:tcBorders>
               <w:top w:val="none"/>
-              <w:left w:val="single" w:sz="20" w:space="0" w:color="003366"/>
+              <w:left w:val="single" w:sz="20" w:space="0" w:color="4A3525"/>
               <w:bottom w:val="none"/>
               <w:right w:val="none"/>
             </w:tcBorders>
@@ -1763,18 +1853,18 @@
               <w:rPr>
                 <w:rFonts w:ascii="Calibri" w:hAnsi="Calibri"/>
                 <w:b/>
-                <w:color w:val="003366"/>
+                <w:color w:val="4A3525"/>
                 <w:sz w:val="20"/>
               </w:rPr>
-              <w:t xml:space="preserve">📌 KẾT NỐI VỚI BƯỚC TIẾP THEO: </w:t>
+              <w:t xml:space="preserve">■ KẾT NỐI VỚI HỆ THỐNG MÁY CHỦ: </w:t>
             </w:r>
             <w:r>
               <w:rPr>
                 <w:rFonts w:ascii="Calibri" w:hAnsi="Calibri"/>
-                <w:color w:val="2D3748"/>
+                <w:color w:val="2C2523"/>
                 <w:sz w:val="19"/>
               </w:rPr>
-              <w:t>Nhờ gói tin này: Khi lưu lên Server ở Bước 3, Server chỉ việc bóc tách chuỗi data_base64 để ghi thẳng thành file ảnh vật lý với đúng tên file_name vào thư mục photos/S1/. Khi làm báo cáo, script Python chỉ việc gọi đúng tên file để chèn vào Word mà không cần lọc dữ liệu!</w:t>
+              <w:t>Gói dữ liệu này cho phép máy chủ tách chuỗi ảnh ghi trực tiếp vào thư mục photos/S1/ với đúng tên định danh. Khi sinh báo cáo tự động, chương trình chỉ cần đối chiếu tên tệp để chèn ảnh vào văn bản mà không phải qua khâu lọc dữ liệu trung gian.</w:t>
             </w:r>
           </w:p>
         </w:tc>

</xml_diff>